<commit_message>
Remove fixed submissions and grading values for adaptable teaching resources
</commit_message>
<xml_diff>
--- a/docs/Data_Dungeon_Chapter_10_Instructor_Guide.docx
+++ b/docs/Data_Dungeon_Chapter_10_Instructor_Guide.docx
@@ -1548,8 +1548,7 @@
         <w:tblLook w:firstColumn="1" w:firstRow="1" w:lastColumn="0" w:lastRow="0" w:noHBand="0" w:noVBand="1" w:val="04A0"/>
       </w:tblPr>
       <w:tblGrid>
-        <w:gridCol w:w="7056"/>
-        <w:gridCol w:w="1152"/>
+        <w:gridCol w:w="8208"/>
       </w:tblGrid>
       <w:tr>
         <w:trPr>
@@ -1557,7 +1556,7 @@
         </w:trPr>
         <w:tc>
           <w:tcPr>
-            <w:tcW w:type="dxa" w:w="7056"/>
+            <w:tcW w:type="dxa" w:w="8208"/>
             <w:shd w:fill="E7E6E6"/>
             <w:vAlign w:val="center"/>
             <w:tcBorders>
@@ -1583,37 +1582,6 @@
                 <w:sz w:val="20"/>
               </w:rPr>
               <w:t>Criterion</w:t>
-            </w:r>
-          </w:p>
-        </w:tc>
-        <w:tc>
-          <w:tcPr>
-            <w:tcW w:type="dxa" w:w="1152"/>
-            <w:shd w:fill="E7E6E6"/>
-            <w:vAlign w:val="center"/>
-            <w:tcBorders>
-              <w:top w:val="single" w:sz="4" w:color="D9D9D9"/>
-              <w:left w:val="single" w:sz="4" w:color="D9D9D9"/>
-              <w:bottom w:val="single" w:sz="4" w:color="D9D9D9"/>
-              <w:right w:val="single" w:sz="4" w:color="D9D9D9"/>
-            </w:tcBorders>
-            <w:tcMar>
-              <w:top w:w="80" w:type="dxa"/>
-              <w:left w:w="80" w:type="dxa"/>
-              <w:bottom w:w="80" w:type="dxa"/>
-              <w:right w:w="80" w:type="dxa"/>
-            </w:tcMar>
-          </w:tcPr>
-          <w:p>
-            <w:pPr>
-              <w:spacing w:after="40" w:before="40"/>
-            </w:pPr>
-            <w:r>
-              <w:rPr>
-                <w:b/>
-                <w:sz w:val="20"/>
-              </w:rPr>
-              <w:t>Points</w:t>
             </w:r>
           </w:p>
         </w:tc>
@@ -1621,7 +1589,7 @@
       <w:tr>
         <w:tc>
           <w:tcPr>
-            <w:tcW w:type="dxa" w:w="7056"/>
+            <w:tcW w:type="dxa" w:w="8208"/>
             <w:vAlign w:val="center"/>
             <w:tcBorders>
               <w:top w:val="single" w:sz="4" w:color="D9D9D9"/>
@@ -1645,35 +1613,6 @@
                 <w:sz w:val="20"/>
               </w:rPr>
               <w:t>Upward repair follows the parent path and stops correctly</w:t>
-            </w:r>
-          </w:p>
-        </w:tc>
-        <w:tc>
-          <w:tcPr>
-            <w:tcW w:type="dxa" w:w="1152"/>
-            <w:vAlign w:val="center"/>
-            <w:tcBorders>
-              <w:top w:val="single" w:sz="4" w:color="D9D9D9"/>
-              <w:left w:val="single" w:sz="4" w:color="D9D9D9"/>
-              <w:bottom w:val="single" w:sz="4" w:color="D9D9D9"/>
-              <w:right w:val="single" w:sz="4" w:color="D9D9D9"/>
-            </w:tcBorders>
-            <w:tcMar>
-              <w:top w:w="80" w:type="dxa"/>
-              <w:left w:w="80" w:type="dxa"/>
-              <w:bottom w:w="80" w:type="dxa"/>
-              <w:right w:w="80" w:type="dxa"/>
-            </w:tcMar>
-          </w:tcPr>
-          <w:p>
-            <w:pPr>
-              <w:spacing w:after="40" w:before="40"/>
-            </w:pPr>
-            <w:r>
-              <w:rPr>
-                <w:sz w:val="20"/>
-              </w:rPr>
-              <w:t>20</w:t>
             </w:r>
           </w:p>
         </w:tc>
@@ -1681,7 +1620,7 @@
       <w:tr>
         <w:tc>
           <w:tcPr>
-            <w:tcW w:type="dxa" w:w="7056"/>
+            <w:tcW w:type="dxa" w:w="8208"/>
             <w:vAlign w:val="center"/>
             <w:tcBorders>
               <w:top w:val="single" w:sz="4" w:color="D9D9D9"/>
@@ -1705,35 +1644,6 @@
                 <w:sz w:val="20"/>
               </w:rPr>
               <w:t>Downward repair selects the earlier existing child</w:t>
-            </w:r>
-          </w:p>
-        </w:tc>
-        <w:tc>
-          <w:tcPr>
-            <w:tcW w:type="dxa" w:w="1152"/>
-            <w:vAlign w:val="center"/>
-            <w:tcBorders>
-              <w:top w:val="single" w:sz="4" w:color="D9D9D9"/>
-              <w:left w:val="single" w:sz="4" w:color="D9D9D9"/>
-              <w:bottom w:val="single" w:sz="4" w:color="D9D9D9"/>
-              <w:right w:val="single" w:sz="4" w:color="D9D9D9"/>
-            </w:tcBorders>
-            <w:tcMar>
-              <w:top w:w="80" w:type="dxa"/>
-              <w:left w:w="80" w:type="dxa"/>
-              <w:bottom w:w="80" w:type="dxa"/>
-              <w:right w:w="80" w:type="dxa"/>
-            </w:tcMar>
-          </w:tcPr>
-          <w:p>
-            <w:pPr>
-              <w:spacing w:after="40" w:before="40"/>
-            </w:pPr>
-            <w:r>
-              <w:rPr>
-                <w:sz w:val="20"/>
-              </w:rPr>
-              <w:t>25</w:t>
             </w:r>
           </w:p>
         </w:tc>
@@ -1741,7 +1651,7 @@
       <w:tr>
         <w:tc>
           <w:tcPr>
-            <w:tcW w:type="dxa" w:w="7056"/>
+            <w:tcW w:type="dxa" w:w="8208"/>
             <w:vAlign w:val="center"/>
             <w:tcBorders>
               <w:top w:val="single" w:sz="4" w:color="D9D9D9"/>
@@ -1765,35 +1675,6 @@
                 <w:sz w:val="20"/>
               </w:rPr>
               <w:t>Tie ordering, boundary tests, and heap invariant</w:t>
-            </w:r>
-          </w:p>
-        </w:tc>
-        <w:tc>
-          <w:tcPr>
-            <w:tcW w:type="dxa" w:w="1152"/>
-            <w:vAlign w:val="center"/>
-            <w:tcBorders>
-              <w:top w:val="single" w:sz="4" w:color="D9D9D9"/>
-              <w:left w:val="single" w:sz="4" w:color="D9D9D9"/>
-              <w:bottom w:val="single" w:sz="4" w:color="D9D9D9"/>
-              <w:right w:val="single" w:sz="4" w:color="D9D9D9"/>
-            </w:tcBorders>
-            <w:tcMar>
-              <w:top w:w="80" w:type="dxa"/>
-              <w:left w:w="80" w:type="dxa"/>
-              <w:bottom w:w="80" w:type="dxa"/>
-              <w:right w:w="80" w:type="dxa"/>
-            </w:tcMar>
-          </w:tcPr>
-          <w:p>
-            <w:pPr>
-              <w:spacing w:after="40" w:before="40"/>
-            </w:pPr>
-            <w:r>
-              <w:rPr>
-                <w:sz w:val="20"/>
-              </w:rPr>
-              <w:t>20</w:t>
             </w:r>
           </w:p>
         </w:tc>
@@ -1801,7 +1682,7 @@
       <w:tr>
         <w:tc>
           <w:tcPr>
-            <w:tcW w:type="dxa" w:w="7056"/>
+            <w:tcW w:type="dxa" w:w="8208"/>
             <w:vAlign w:val="center"/>
             <w:tcBorders>
               <w:top w:val="single" w:sz="4" w:color="D9D9D9"/>
@@ -1825,35 +1706,6 @@
                 <w:sz w:val="20"/>
               </w:rPr>
               <w:t>Adventure trace and array-index explanations</w:t>
-            </w:r>
-          </w:p>
-        </w:tc>
-        <w:tc>
-          <w:tcPr>
-            <w:tcW w:type="dxa" w:w="1152"/>
-            <w:vAlign w:val="center"/>
-            <w:tcBorders>
-              <w:top w:val="single" w:sz="4" w:color="D9D9D9"/>
-              <w:left w:val="single" w:sz="4" w:color="D9D9D9"/>
-              <w:bottom w:val="single" w:sz="4" w:color="D9D9D9"/>
-              <w:right w:val="single" w:sz="4" w:color="D9D9D9"/>
-            </w:tcBorders>
-            <w:tcMar>
-              <w:top w:w="80" w:type="dxa"/>
-              <w:left w:w="80" w:type="dxa"/>
-              <w:bottom w:w="80" w:type="dxa"/>
-              <w:right w:w="80" w:type="dxa"/>
-            </w:tcMar>
-          </w:tcPr>
-          <w:p>
-            <w:pPr>
-              <w:spacing w:after="40" w:before="40"/>
-            </w:pPr>
-            <w:r>
-              <w:rPr>
-                <w:sz w:val="20"/>
-              </w:rPr>
-              <w:t>15</w:t>
             </w:r>
           </w:p>
         </w:tc>
@@ -1861,7 +1713,7 @@
       <w:tr>
         <w:tc>
           <w:tcPr>
-            <w:tcW w:type="dxa" w:w="7056"/>
+            <w:tcW w:type="dxa" w:w="8208"/>
             <w:vAlign w:val="center"/>
             <w:tcBorders>
               <w:top w:val="single" w:sz="4" w:color="D9D9D9"/>
@@ -1885,35 +1737,6 @@
                 <w:sz w:val="20"/>
               </w:rPr>
               <w:t>Structure comparison and evaluated AI or no-AI evidence</w:t>
-            </w:r>
-          </w:p>
-        </w:tc>
-        <w:tc>
-          <w:tcPr>
-            <w:tcW w:type="dxa" w:w="1152"/>
-            <w:vAlign w:val="center"/>
-            <w:tcBorders>
-              <w:top w:val="single" w:sz="4" w:color="D9D9D9"/>
-              <w:left w:val="single" w:sz="4" w:color="D9D9D9"/>
-              <w:bottom w:val="single" w:sz="4" w:color="D9D9D9"/>
-              <w:right w:val="single" w:sz="4" w:color="D9D9D9"/>
-            </w:tcBorders>
-            <w:tcMar>
-              <w:top w:w="80" w:type="dxa"/>
-              <w:left w:w="80" w:type="dxa"/>
-              <w:bottom w:w="80" w:type="dxa"/>
-              <w:right w:w="80" w:type="dxa"/>
-            </w:tcMar>
-          </w:tcPr>
-          <w:p>
-            <w:pPr>
-              <w:spacing w:after="40" w:before="40"/>
-            </w:pPr>
-            <w:r>
-              <w:rPr>
-                <w:sz w:val="20"/>
-              </w:rPr>
-              <w:t>20</w:t>
             </w:r>
           </w:p>
         </w:tc>
@@ -1922,7 +1745,7 @@
     <w:p/>
     <w:p>
       <w:r>
-        <w:t>The no-AI exercise targets the same reasoning and receives the same credit. Assess independently predicted output and operation-based justification, not the length or polish of an AI response.</w:t>
+        <w:t>The no-AI exercise targets the same reasoning. Assess independently predicted output and operation-based justification, not the length or polish of an AI response.</w:t>
       </w:r>
     </w:p>
     <w:p>

</xml_diff>